<commit_message>
Completed revisions, before co-author check.
</commit_message>
<xml_diff>
--- a/MO_reference_doc.docx
+++ b/MO_reference_doc.docx
@@ -1,6 +1,6 @@
 
 <file path=word/document.xml><?xml version="1.0" encoding="utf-8"?>
-<w:document xmlns:wpc="http://schemas.microsoft.com/office/word/2010/wordprocessingCanvas" xmlns:cx="http://schemas.microsoft.com/office/drawing/2014/chartex" xmlns:cx1="http://schemas.microsoft.com/office/drawing/2015/9/8/chartex" xmlns:cx2="http://schemas.microsoft.com/office/drawing/2015/10/21/chartex" xmlns:cx3="http://schemas.microsoft.com/office/drawing/2016/5/9/chartex" xmlns:cx4="http://schemas.microsoft.com/office/drawing/2016/5/10/chartex" xmlns:cx5="http://schemas.microsoft.com/office/drawing/2016/5/11/chartex" xmlns:cx6="http://schemas.microsoft.com/office/drawing/2016/5/12/chartex" xmlns:cx7="http://schemas.microsoft.com/office/drawing/2016/5/13/chartex" xmlns:cx8="http://schemas.microsoft.com/office/drawing/2016/5/14/chartex" xmlns:mc="http://schemas.openxmlformats.org/markup-compatibility/2006" xmlns:aink="http://schemas.microsoft.com/office/drawing/2016/ink" xmlns:am3d="http://schemas.microsoft.com/office/drawing/2017/model3d" xmlns:o="urn:schemas-microsoft-com:office:office" xmlns:oel="http://schemas.microsoft.com/office/2019/extlst" xmlns:r="http://schemas.openxmlformats.org/officeDocument/2006/relationships" xmlns:m="http://schemas.openxmlformats.org/officeDocument/2006/math" xmlns:v="urn:schemas-microsoft-com:vml" xmlns:wp14="http://schemas.microsoft.com/office/word/2010/wordprocessingDrawing" xmlns:wp="http://schemas.openxmlformats.org/drawingml/2006/wordprocessingDrawing" xmlns:w10="urn:schemas-microsoft-com:office:word" xmlns:w="http://schemas.openxmlformats.org/wordprocessingml/2006/main" xmlns:w14="http://schemas.microsoft.com/office/word/2010/wordml" xmlns:w15="http://schemas.microsoft.com/office/word/2012/wordml" xmlns:w16cei="http://schemas.microsoft.com/office/word/2026/wordml/cei" xmlns:w16cex="http://schemas.microsoft.com/office/word/2018/wordml/cex" xmlns:w16cid="http://schemas.microsoft.com/office/word/2016/wordml/cid" xmlns:w16="http://schemas.microsoft.com/office/word/2018/wordml" xmlns:w16du="http://schemas.microsoft.com/office/word/2023/wordml/word16du" xmlns:w16sdtdh="http://schemas.microsoft.com/office/word/2020/wordml/sdtdatahash" xmlns:w16sdtfl="http://schemas.microsoft.com/office/word/2024/wordml/sdtformatlock" xmlns:w16se="http://schemas.microsoft.com/office/word/2015/wordml/symex" xmlns:wpg="http://schemas.microsoft.com/office/word/2010/wordprocessingGroup" xmlns:wpi="http://schemas.microsoft.com/office/word/2010/wordprocessingInk" xmlns:wne="http://schemas.microsoft.com/office/word/2006/wordml" xmlns:wps="http://schemas.microsoft.com/office/word/2010/wordprocessingShape" mc:Ignorable="w14 w15 w16se w16cid w16 w16cex w16sdtdh w16sdtfl w16du wp14">
+<w:document xmlns:wpc="http://schemas.microsoft.com/office/word/2010/wordprocessingCanvas" xmlns:cx="http://schemas.microsoft.com/office/drawing/2014/chartex" xmlns:cx1="http://schemas.microsoft.com/office/drawing/2015/9/8/chartex" xmlns:cx2="http://schemas.microsoft.com/office/drawing/2015/10/21/chartex" xmlns:cx3="http://schemas.microsoft.com/office/drawing/2016/5/9/chartex" xmlns:cx4="http://schemas.microsoft.com/office/drawing/2016/5/10/chartex" xmlns:cx5="http://schemas.microsoft.com/office/drawing/2016/5/11/chartex" xmlns:cx6="http://schemas.microsoft.com/office/drawing/2016/5/12/chartex" xmlns:cx7="http://schemas.microsoft.com/office/drawing/2016/5/13/chartex" xmlns:cx8="http://schemas.microsoft.com/office/drawing/2016/5/14/chartex" xmlns:mc="http://schemas.openxmlformats.org/markup-compatibility/2006" xmlns:aink="http://schemas.microsoft.com/office/drawing/2016/ink" xmlns:am3d="http://schemas.microsoft.com/office/drawing/2017/model3d" xmlns:o="urn:schemas-microsoft-com:office:office" xmlns:oel="http://schemas.microsoft.com/office/2019/extlst" xmlns:r="http://schemas.openxmlformats.org/officeDocument/2006/relationships" xmlns:m="http://schemas.openxmlformats.org/officeDocument/2006/math" xmlns:v="urn:schemas-microsoft-com:vml" xmlns:wp14="http://schemas.microsoft.com/office/word/2010/wordprocessingDrawing" xmlns:wp="http://schemas.openxmlformats.org/drawingml/2006/wordprocessingDrawing" xmlns:w10="urn:schemas-microsoft-com:office:word" xmlns:w="http://schemas.openxmlformats.org/wordprocessingml/2006/main" xmlns:w14="http://schemas.microsoft.com/office/word/2010/wordml" xmlns:w15="http://schemas.microsoft.com/office/word/2012/wordml" xmlns:w16cex="http://schemas.microsoft.com/office/word/2018/wordml/cex" xmlns:w16cid="http://schemas.microsoft.com/office/word/2016/wordml/cid" xmlns:w16="http://schemas.microsoft.com/office/word/2018/wordml" xmlns:w16du="http://schemas.microsoft.com/office/word/2023/wordml/word16du" xmlns:w16sdtdh="http://schemas.microsoft.com/office/word/2020/wordml/sdtdatahash" xmlns:w16sdtfl="http://schemas.microsoft.com/office/word/2024/wordml/sdtformatlock" xmlns:w16se="http://schemas.microsoft.com/office/word/2015/wordml/symex" xmlns:wpg="http://schemas.microsoft.com/office/word/2010/wordprocessingGroup" xmlns:wpi="http://schemas.microsoft.com/office/word/2010/wordprocessingInk" xmlns:wne="http://schemas.microsoft.com/office/word/2006/wordml" xmlns:wps="http://schemas.microsoft.com/office/word/2010/wordprocessingShape" mc:Ignorable="w14 w15 w16se w16cid w16 w16cex w16sdtdh w16sdtfl w16du wp14">
   <w:body>
     <w:p>
       <w:pPr>
@@ -196,9 +196,20 @@
     <w:p>
       <w:pPr>
         <w:pStyle w:val="TableCaption"/>
-      </w:pPr>
-      <w:r>
-        <w:t xml:space="preserve"> Table caption. </w:t>
+        <w:rPr>
+          <w:i w:val="0"/>
+          <w:iCs/>
+        </w:rPr>
+      </w:pPr>
+      <w:r>
+        <w:t xml:space="preserve"> </w:t>
+      </w:r>
+      <w:r>
+        <w:rPr>
+          <w:i w:val="0"/>
+          <w:iCs/>
+        </w:rPr>
+        <w:t xml:space="preserve">Table caption. </w:t>
       </w:r>
     </w:p>
     <w:tbl>
@@ -279,8 +290,16 @@
     <w:p>
       <w:pPr>
         <w:pStyle w:val="ImageCaption"/>
-      </w:pPr>
-      <w:r>
+        <w:rPr>
+          <w:i w:val="0"/>
+          <w:iCs/>
+        </w:rPr>
+      </w:pPr>
+      <w:r>
+        <w:rPr>
+          <w:i w:val="0"/>
+          <w:iCs/>
+        </w:rPr>
         <w:t xml:space="preserve"> Image Caption </w:t>
       </w:r>
     </w:p>
@@ -346,7 +365,7 @@
 </file>
 
 <file path=word/endnotes.xml><?xml version="1.0" encoding="utf-8"?>
-<w:endnotes xmlns:wpc="http://schemas.microsoft.com/office/word/2010/wordprocessingCanvas" xmlns:cx="http://schemas.microsoft.com/office/drawing/2014/chartex" xmlns:cx1="http://schemas.microsoft.com/office/drawing/2015/9/8/chartex" xmlns:cx2="http://schemas.microsoft.com/office/drawing/2015/10/21/chartex" xmlns:cx3="http://schemas.microsoft.com/office/drawing/2016/5/9/chartex" xmlns:cx4="http://schemas.microsoft.com/office/drawing/2016/5/10/chartex" xmlns:cx5="http://schemas.microsoft.com/office/drawing/2016/5/11/chartex" xmlns:cx6="http://schemas.microsoft.com/office/drawing/2016/5/12/chartex" xmlns:cx7="http://schemas.microsoft.com/office/drawing/2016/5/13/chartex" xmlns:cx8="http://schemas.microsoft.com/office/drawing/2016/5/14/chartex" xmlns:mc="http://schemas.openxmlformats.org/markup-compatibility/2006" xmlns:aink="http://schemas.microsoft.com/office/drawing/2016/ink" xmlns:am3d="http://schemas.microsoft.com/office/drawing/2017/model3d" xmlns:o="urn:schemas-microsoft-com:office:office" xmlns:oel="http://schemas.microsoft.com/office/2019/extlst" xmlns:r="http://schemas.openxmlformats.org/officeDocument/2006/relationships" xmlns:m="http://schemas.openxmlformats.org/officeDocument/2006/math" xmlns:v="urn:schemas-microsoft-com:vml" xmlns:wp14="http://schemas.microsoft.com/office/word/2010/wordprocessingDrawing" xmlns:wp="http://schemas.openxmlformats.org/drawingml/2006/wordprocessingDrawing" xmlns:w10="urn:schemas-microsoft-com:office:word" xmlns:w="http://schemas.openxmlformats.org/wordprocessingml/2006/main" xmlns:w14="http://schemas.microsoft.com/office/word/2010/wordml" xmlns:w15="http://schemas.microsoft.com/office/word/2012/wordml" xmlns:w16cei="http://schemas.microsoft.com/office/word/2026/wordml/cei" xmlns:w16cex="http://schemas.microsoft.com/office/word/2018/wordml/cex" xmlns:w16cid="http://schemas.microsoft.com/office/word/2016/wordml/cid" xmlns:w16="http://schemas.microsoft.com/office/word/2018/wordml" xmlns:w16du="http://schemas.microsoft.com/office/word/2023/wordml/word16du" xmlns:w16sdtdh="http://schemas.microsoft.com/office/word/2020/wordml/sdtdatahash" xmlns:w16sdtfl="http://schemas.microsoft.com/office/word/2024/wordml/sdtformatlock" xmlns:w16se="http://schemas.microsoft.com/office/word/2015/wordml/symex" xmlns:wpg="http://schemas.microsoft.com/office/word/2010/wordprocessingGroup" xmlns:wpi="http://schemas.microsoft.com/office/word/2010/wordprocessingInk" xmlns:wne="http://schemas.microsoft.com/office/word/2006/wordml" xmlns:wps="http://schemas.microsoft.com/office/word/2010/wordprocessingShape" mc:Ignorable="w14 w15 w16se w16cid w16 w16cex w16sdtdh w16sdtfl w16du wp14">
+<w:endnotes xmlns:wpc="http://schemas.microsoft.com/office/word/2010/wordprocessingCanvas" xmlns:cx="http://schemas.microsoft.com/office/drawing/2014/chartex" xmlns:cx1="http://schemas.microsoft.com/office/drawing/2015/9/8/chartex" xmlns:cx2="http://schemas.microsoft.com/office/drawing/2015/10/21/chartex" xmlns:cx3="http://schemas.microsoft.com/office/drawing/2016/5/9/chartex" xmlns:cx4="http://schemas.microsoft.com/office/drawing/2016/5/10/chartex" xmlns:cx5="http://schemas.microsoft.com/office/drawing/2016/5/11/chartex" xmlns:cx6="http://schemas.microsoft.com/office/drawing/2016/5/12/chartex" xmlns:cx7="http://schemas.microsoft.com/office/drawing/2016/5/13/chartex" xmlns:cx8="http://schemas.microsoft.com/office/drawing/2016/5/14/chartex" xmlns:mc="http://schemas.openxmlformats.org/markup-compatibility/2006" xmlns:aink="http://schemas.microsoft.com/office/drawing/2016/ink" xmlns:am3d="http://schemas.microsoft.com/office/drawing/2017/model3d" xmlns:o="urn:schemas-microsoft-com:office:office" xmlns:oel="http://schemas.microsoft.com/office/2019/extlst" xmlns:r="http://schemas.openxmlformats.org/officeDocument/2006/relationships" xmlns:m="http://schemas.openxmlformats.org/officeDocument/2006/math" xmlns:v="urn:schemas-microsoft-com:vml" xmlns:wp14="http://schemas.microsoft.com/office/word/2010/wordprocessingDrawing" xmlns:wp="http://schemas.openxmlformats.org/drawingml/2006/wordprocessingDrawing" xmlns:w10="urn:schemas-microsoft-com:office:word" xmlns:w="http://schemas.openxmlformats.org/wordprocessingml/2006/main" xmlns:w14="http://schemas.microsoft.com/office/word/2010/wordml" xmlns:w15="http://schemas.microsoft.com/office/word/2012/wordml" xmlns:w16cex="http://schemas.microsoft.com/office/word/2018/wordml/cex" xmlns:w16cid="http://schemas.microsoft.com/office/word/2016/wordml/cid" xmlns:w16="http://schemas.microsoft.com/office/word/2018/wordml" xmlns:w16du="http://schemas.microsoft.com/office/word/2023/wordml/word16du" xmlns:w16sdtdh="http://schemas.microsoft.com/office/word/2020/wordml/sdtdatahash" xmlns:w16sdtfl="http://schemas.microsoft.com/office/word/2024/wordml/sdtformatlock" xmlns:w16se="http://schemas.microsoft.com/office/word/2015/wordml/symex" xmlns:wpg="http://schemas.microsoft.com/office/word/2010/wordprocessingGroup" xmlns:wpi="http://schemas.microsoft.com/office/word/2010/wordprocessingInk" xmlns:wne="http://schemas.microsoft.com/office/word/2006/wordml" xmlns:wps="http://schemas.microsoft.com/office/word/2010/wordprocessingShape" mc:Ignorable="w14 w15 w16se w16cid w16 w16cex w16sdtdh w16sdtfl w16du wp14">
   <w:endnote w:type="separator" w:id="-1">
     <w:p>
       <w:pPr>
@@ -371,7 +390,7 @@
 </file>
 
 <file path=word/footnotes.xml><?xml version="1.0" encoding="utf-8"?>
-<w:footnotes xmlns:wpc="http://schemas.microsoft.com/office/word/2010/wordprocessingCanvas" xmlns:cx="http://schemas.microsoft.com/office/drawing/2014/chartex" xmlns:cx1="http://schemas.microsoft.com/office/drawing/2015/9/8/chartex" xmlns:cx2="http://schemas.microsoft.com/office/drawing/2015/10/21/chartex" xmlns:cx3="http://schemas.microsoft.com/office/drawing/2016/5/9/chartex" xmlns:cx4="http://schemas.microsoft.com/office/drawing/2016/5/10/chartex" xmlns:cx5="http://schemas.microsoft.com/office/drawing/2016/5/11/chartex" xmlns:cx6="http://schemas.microsoft.com/office/drawing/2016/5/12/chartex" xmlns:cx7="http://schemas.microsoft.com/office/drawing/2016/5/13/chartex" xmlns:cx8="http://schemas.microsoft.com/office/drawing/2016/5/14/chartex" xmlns:mc="http://schemas.openxmlformats.org/markup-compatibility/2006" xmlns:aink="http://schemas.microsoft.com/office/drawing/2016/ink" xmlns:am3d="http://schemas.microsoft.com/office/drawing/2017/model3d" xmlns:o="urn:schemas-microsoft-com:office:office" xmlns:oel="http://schemas.microsoft.com/office/2019/extlst" xmlns:r="http://schemas.openxmlformats.org/officeDocument/2006/relationships" xmlns:m="http://schemas.openxmlformats.org/officeDocument/2006/math" xmlns:v="urn:schemas-microsoft-com:vml" xmlns:wp14="http://schemas.microsoft.com/office/word/2010/wordprocessingDrawing" xmlns:wp="http://schemas.openxmlformats.org/drawingml/2006/wordprocessingDrawing" xmlns:w10="urn:schemas-microsoft-com:office:word" xmlns:w="http://schemas.openxmlformats.org/wordprocessingml/2006/main" xmlns:w14="http://schemas.microsoft.com/office/word/2010/wordml" xmlns:w15="http://schemas.microsoft.com/office/word/2012/wordml" xmlns:w16cei="http://schemas.microsoft.com/office/word/2026/wordml/cei" xmlns:w16cex="http://schemas.microsoft.com/office/word/2018/wordml/cex" xmlns:w16cid="http://schemas.microsoft.com/office/word/2016/wordml/cid" xmlns:w16="http://schemas.microsoft.com/office/word/2018/wordml" xmlns:w16du="http://schemas.microsoft.com/office/word/2023/wordml/word16du" xmlns:w16sdtdh="http://schemas.microsoft.com/office/word/2020/wordml/sdtdatahash" xmlns:w16sdtfl="http://schemas.microsoft.com/office/word/2024/wordml/sdtformatlock" xmlns:w16se="http://schemas.microsoft.com/office/word/2015/wordml/symex" xmlns:wpg="http://schemas.microsoft.com/office/word/2010/wordprocessingGroup" xmlns:wpi="http://schemas.microsoft.com/office/word/2010/wordprocessingInk" xmlns:wne="http://schemas.microsoft.com/office/word/2006/wordml" xmlns:wps="http://schemas.microsoft.com/office/word/2010/wordprocessingShape" mc:Ignorable="w14 w15 w16se w16cid w16 w16cex w16sdtdh w16sdtfl w16du wp14">
+<w:footnotes xmlns:wpc="http://schemas.microsoft.com/office/word/2010/wordprocessingCanvas" xmlns:cx="http://schemas.microsoft.com/office/drawing/2014/chartex" xmlns:cx1="http://schemas.microsoft.com/office/drawing/2015/9/8/chartex" xmlns:cx2="http://schemas.microsoft.com/office/drawing/2015/10/21/chartex" xmlns:cx3="http://schemas.microsoft.com/office/drawing/2016/5/9/chartex" xmlns:cx4="http://schemas.microsoft.com/office/drawing/2016/5/10/chartex" xmlns:cx5="http://schemas.microsoft.com/office/drawing/2016/5/11/chartex" xmlns:cx6="http://schemas.microsoft.com/office/drawing/2016/5/12/chartex" xmlns:cx7="http://schemas.microsoft.com/office/drawing/2016/5/13/chartex" xmlns:cx8="http://schemas.microsoft.com/office/drawing/2016/5/14/chartex" xmlns:mc="http://schemas.openxmlformats.org/markup-compatibility/2006" xmlns:aink="http://schemas.microsoft.com/office/drawing/2016/ink" xmlns:am3d="http://schemas.microsoft.com/office/drawing/2017/model3d" xmlns:o="urn:schemas-microsoft-com:office:office" xmlns:oel="http://schemas.microsoft.com/office/2019/extlst" xmlns:r="http://schemas.openxmlformats.org/officeDocument/2006/relationships" xmlns:m="http://schemas.openxmlformats.org/officeDocument/2006/math" xmlns:v="urn:schemas-microsoft-com:vml" xmlns:wp14="http://schemas.microsoft.com/office/word/2010/wordprocessingDrawing" xmlns:wp="http://schemas.openxmlformats.org/drawingml/2006/wordprocessingDrawing" xmlns:w10="urn:schemas-microsoft-com:office:word" xmlns:w="http://schemas.openxmlformats.org/wordprocessingml/2006/main" xmlns:w14="http://schemas.microsoft.com/office/word/2010/wordml" xmlns:w15="http://schemas.microsoft.com/office/word/2012/wordml" xmlns:w16cex="http://schemas.microsoft.com/office/word/2018/wordml/cex" xmlns:w16cid="http://schemas.microsoft.com/office/word/2016/wordml/cid" xmlns:w16="http://schemas.microsoft.com/office/word/2018/wordml" xmlns:w16du="http://schemas.microsoft.com/office/word/2023/wordml/word16du" xmlns:w16sdtdh="http://schemas.microsoft.com/office/word/2020/wordml/sdtdatahash" xmlns:w16sdtfl="http://schemas.microsoft.com/office/word/2024/wordml/sdtformatlock" xmlns:w16se="http://schemas.microsoft.com/office/word/2015/wordml/symex" xmlns:wpg="http://schemas.microsoft.com/office/word/2010/wordprocessingGroup" xmlns:wpi="http://schemas.microsoft.com/office/word/2010/wordprocessingInk" xmlns:wne="http://schemas.microsoft.com/office/word/2006/wordml" xmlns:wps="http://schemas.microsoft.com/office/word/2010/wordprocessingShape" mc:Ignorable="w14 w15 w16se w16cid w16 w16cex w16sdtdh w16sdtfl w16du wp14">
   <w:footnote w:type="separator" w:id="-1">
     <w:p>
       <w:r>
@@ -406,7 +425,7 @@
 </file>
 
 <file path=word/numbering.xml><?xml version="1.0" encoding="utf-8"?>
-<w:numbering xmlns:wpc="http://schemas.microsoft.com/office/word/2010/wordprocessingCanvas" xmlns:cx="http://schemas.microsoft.com/office/drawing/2014/chartex" xmlns:cx1="http://schemas.microsoft.com/office/drawing/2015/9/8/chartex" xmlns:cx2="http://schemas.microsoft.com/office/drawing/2015/10/21/chartex" xmlns:cx3="http://schemas.microsoft.com/office/drawing/2016/5/9/chartex" xmlns:cx4="http://schemas.microsoft.com/office/drawing/2016/5/10/chartex" xmlns:cx5="http://schemas.microsoft.com/office/drawing/2016/5/11/chartex" xmlns:cx6="http://schemas.microsoft.com/office/drawing/2016/5/12/chartex" xmlns:cx7="http://schemas.microsoft.com/office/drawing/2016/5/13/chartex" xmlns:cx8="http://schemas.microsoft.com/office/drawing/2016/5/14/chartex" xmlns:mc="http://schemas.openxmlformats.org/markup-compatibility/2006" xmlns:aink="http://schemas.microsoft.com/office/drawing/2016/ink" xmlns:am3d="http://schemas.microsoft.com/office/drawing/2017/model3d" xmlns:o="urn:schemas-microsoft-com:office:office" xmlns:oel="http://schemas.microsoft.com/office/2019/extlst" xmlns:r="http://schemas.openxmlformats.org/officeDocument/2006/relationships" xmlns:m="http://schemas.openxmlformats.org/officeDocument/2006/math" xmlns:v="urn:schemas-microsoft-com:vml" xmlns:wp14="http://schemas.microsoft.com/office/word/2010/wordprocessingDrawing" xmlns:wp="http://schemas.openxmlformats.org/drawingml/2006/wordprocessingDrawing" xmlns:w10="urn:schemas-microsoft-com:office:word" xmlns:w="http://schemas.openxmlformats.org/wordprocessingml/2006/main" xmlns:w14="http://schemas.microsoft.com/office/word/2010/wordml" xmlns:w15="http://schemas.microsoft.com/office/word/2012/wordml" xmlns:w16cei="http://schemas.microsoft.com/office/word/2026/wordml/cei" xmlns:w16cex="http://schemas.microsoft.com/office/word/2018/wordml/cex" xmlns:w16cid="http://schemas.microsoft.com/office/word/2016/wordml/cid" xmlns:w16="http://schemas.microsoft.com/office/word/2018/wordml" xmlns:w16du="http://schemas.microsoft.com/office/word/2023/wordml/word16du" xmlns:w16sdtdh="http://schemas.microsoft.com/office/word/2020/wordml/sdtdatahash" xmlns:w16sdtfl="http://schemas.microsoft.com/office/word/2024/wordml/sdtformatlock" xmlns:w16se="http://schemas.microsoft.com/office/word/2015/wordml/symex" xmlns:wpg="http://schemas.microsoft.com/office/word/2010/wordprocessingGroup" xmlns:wpi="http://schemas.microsoft.com/office/word/2010/wordprocessingInk" xmlns:wne="http://schemas.microsoft.com/office/word/2006/wordml" xmlns:wps="http://schemas.microsoft.com/office/word/2010/wordprocessingShape" mc:Ignorable="w14 w15 w16se w16cid w16 w16cex w16sdtdh w16sdtfl w16du wp14">
+<w:numbering xmlns:wpc="http://schemas.microsoft.com/office/word/2010/wordprocessingCanvas" xmlns:cx="http://schemas.microsoft.com/office/drawing/2014/chartex" xmlns:cx1="http://schemas.microsoft.com/office/drawing/2015/9/8/chartex" xmlns:cx2="http://schemas.microsoft.com/office/drawing/2015/10/21/chartex" xmlns:cx3="http://schemas.microsoft.com/office/drawing/2016/5/9/chartex" xmlns:cx4="http://schemas.microsoft.com/office/drawing/2016/5/10/chartex" xmlns:cx5="http://schemas.microsoft.com/office/drawing/2016/5/11/chartex" xmlns:cx6="http://schemas.microsoft.com/office/drawing/2016/5/12/chartex" xmlns:cx7="http://schemas.microsoft.com/office/drawing/2016/5/13/chartex" xmlns:cx8="http://schemas.microsoft.com/office/drawing/2016/5/14/chartex" xmlns:mc="http://schemas.openxmlformats.org/markup-compatibility/2006" xmlns:aink="http://schemas.microsoft.com/office/drawing/2016/ink" xmlns:am3d="http://schemas.microsoft.com/office/drawing/2017/model3d" xmlns:o="urn:schemas-microsoft-com:office:office" xmlns:oel="http://schemas.microsoft.com/office/2019/extlst" xmlns:r="http://schemas.openxmlformats.org/officeDocument/2006/relationships" xmlns:m="http://schemas.openxmlformats.org/officeDocument/2006/math" xmlns:v="urn:schemas-microsoft-com:vml" xmlns:wp14="http://schemas.microsoft.com/office/word/2010/wordprocessingDrawing" xmlns:wp="http://schemas.openxmlformats.org/drawingml/2006/wordprocessingDrawing" xmlns:w10="urn:schemas-microsoft-com:office:word" xmlns:w="http://schemas.openxmlformats.org/wordprocessingml/2006/main" xmlns:w14="http://schemas.microsoft.com/office/word/2010/wordml" xmlns:w15="http://schemas.microsoft.com/office/word/2012/wordml" xmlns:w16cex="http://schemas.microsoft.com/office/word/2018/wordml/cex" xmlns:w16cid="http://schemas.microsoft.com/office/word/2016/wordml/cid" xmlns:w16="http://schemas.microsoft.com/office/word/2018/wordml" xmlns:w16du="http://schemas.microsoft.com/office/word/2023/wordml/word16du" xmlns:w16sdtdh="http://schemas.microsoft.com/office/word/2020/wordml/sdtdatahash" xmlns:w16sdtfl="http://schemas.microsoft.com/office/word/2024/wordml/sdtformatlock" xmlns:w16se="http://schemas.microsoft.com/office/word/2015/wordml/symex" xmlns:wpg="http://schemas.microsoft.com/office/word/2010/wordprocessingGroup" xmlns:wpi="http://schemas.microsoft.com/office/word/2010/wordprocessingInk" xmlns:wne="http://schemas.microsoft.com/office/word/2006/wordml" xmlns:wps="http://schemas.microsoft.com/office/word/2010/wordprocessingShape" mc:Ignorable="w14 w15 w16se w16cid w16 w16cex w16sdtdh w16sdtfl w16du wp14">
   <w:abstractNum w:abstractNumId="0" w15:restartNumberingAfterBreak="0">
     <w:nsid w:val="170CD2DE"/>
     <w:multiLevelType w:val="multilevel"/>
@@ -531,7 +550,7 @@
     <w:pPrDefault>
       <w:pPr>
         <w:spacing w:line="480" w:lineRule="auto"/>
-        <w:ind w:firstLine="720"/>
+        <w:ind w:firstLine="0"/>
       </w:pPr>
     </w:pPrDefault>
   </w:docDefaults>
@@ -792,7 +811,7 @@
     <w:pPr>
       <w:keepNext/>
       <w:keepLines/>
-      <w:spacing w:before="360" w:after="120" w:line="240" w:lineRule="auto"/>
+      <w:spacing w:before="360" w:after="480" w:line="240" w:lineRule="auto"/>
       <w:ind w:firstLine="0"/>
       <w:outlineLvl w:val="0"/>
     </w:pPr>
@@ -964,6 +983,9 @@
     <w:name w:val="Body Text"/>
     <w:basedOn w:val="Normal"/>
     <w:qFormat/>
+    <w:pPr>
+      <w:spacing w:after="480"/>
+    </w:pPr>
   </w:style>
   <w:style w:type="paragraph" w:customStyle="1" w:styleId="FirstParagraph">
     <w:name w:val="First Paragraph"/>
@@ -1051,6 +1073,20 @@
       <w:szCs w:val="22"/>
     </w:rPr>
   </w:style>
+  <w:style w:type="paragraph" w:customStyle="1" w:styleId="Received">
+    <w:name w:val="Received"/>
+    <w:basedOn w:val="Normal"/>
+    <w:next w:val="BodyText"/>
+    <w:qFormat/>
+    <w:pPr>
+      <w:spacing w:before="240" w:line="240" w:lineRule="auto"/>
+      <w:ind w:firstLine="0"/>
+      <w:jc w:val="center"/>
+    </w:pPr>
+    <w:rPr>
+      <w:i/>
+    </w:rPr>
+  </w:style>
   <w:style w:type="paragraph" w:styleId="Date">
     <w:name w:val="Date"/>
     <w:basedOn w:val="Normal"/>
@@ -1096,7 +1132,7 @@
     <w:basedOn w:val="Normal"/>
     <w:qFormat/>
     <w:pPr>
-      <w:ind w:left="720" w:hanging="720"/>
+      <w:ind w:left="432" w:hanging="432"/>
     </w:pPr>
   </w:style>
   <w:style w:type="paragraph" w:styleId="BlockText">
@@ -1140,6 +1176,14 @@
         <w:right w:w="108" w:type="dxa"/>
       </w:tblCellMar>
     </w:tblPr>
+    <w:tblStylePr w:type="firstRow">
+      <w:tcPr>
+        <w:tcBorders>
+          <w:top w:val="single" w:sz="4" w:space="0" w:color="auto"/>
+          <w:bottom w:val="single" w:sz="4" w:space="0" w:color="auto"/>
+        </w:tcBorders>
+      </w:tcPr>
+    </w:tblStylePr>
   </w:style>
   <w:style w:type="paragraph" w:customStyle="1" w:styleId="DefinitionTerm">
     <w:name w:val="Definition Term"/>
@@ -1166,9 +1210,6 @@
       <w:ind w:firstLine="0"/>
       <w:jc w:val="center"/>
     </w:pPr>
-    <w:rPr>
-      <w:i/>
-    </w:rPr>
   </w:style>
   <w:style w:type="paragraph" w:customStyle="1" w:styleId="TableCaption">
     <w:name w:val="Table Caption"/>

</xml_diff>